<commit_message>
Word de Metodos-Resultados-Discusion rehecho: tablas, figuras y formato revisados en Word
Co-Authored-By: Claude Opus 5.5 <noreply@anthropic.com>
</commit_message>
<xml_diff>
--- a/entregas/Análisis multivariado de la SLR qué hicimos y qué encontramos.docx
+++ b/entregas/Análisis multivariado de la SLR qué hicimos y qué encontramos.docx
@@ -5,68 +5,146 @@
     <w:p>
       <w:pPr>
         <w:pStyle w:val="Title"/>
-      </w:pPr>
-      <w:r>
+        <w:jc w:val="center"/>
+      </w:pPr>
+      <w:r>
+        <w:rPr>
+          <w:b/>
+          <w:sz w:val="28"/>
+        </w:rPr>
         <w:t xml:space="preserve">Análisis</w:t>
       </w:r>
       <w:r>
+        <w:rPr>
+          <w:b/>
+          <w:sz w:val="28"/>
+        </w:rPr>
         <w:t xml:space="preserve"> </w:t>
       </w:r>
       <w:r>
+        <w:rPr>
+          <w:b/>
+          <w:sz w:val="28"/>
+        </w:rPr>
         <w:t xml:space="preserve">multivariado</w:t>
       </w:r>
       <w:r>
+        <w:rPr>
+          <w:b/>
+          <w:sz w:val="28"/>
+        </w:rPr>
         <w:t xml:space="preserve"> </w:t>
       </w:r>
       <w:r>
+        <w:rPr>
+          <w:b/>
+          <w:sz w:val="28"/>
+        </w:rPr>
         <w:t xml:space="preserve">de</w:t>
       </w:r>
       <w:r>
+        <w:rPr>
+          <w:b/>
+          <w:sz w:val="28"/>
+        </w:rPr>
         <w:t xml:space="preserve"> </w:t>
       </w:r>
       <w:r>
+        <w:rPr>
+          <w:b/>
+          <w:sz w:val="28"/>
+        </w:rPr>
         <w:t xml:space="preserve">la</w:t>
       </w:r>
       <w:r>
+        <w:rPr>
+          <w:b/>
+          <w:sz w:val="28"/>
+        </w:rPr>
         <w:t xml:space="preserve"> </w:t>
       </w:r>
       <w:r>
+        <w:rPr>
+          <w:b/>
+          <w:sz w:val="28"/>
+        </w:rPr>
         <w:t xml:space="preserve">SLR:</w:t>
       </w:r>
       <w:r>
+        <w:rPr>
+          <w:b/>
+          <w:sz w:val="28"/>
+        </w:rPr>
         <w:t xml:space="preserve"> </w:t>
       </w:r>
       <w:r>
+        <w:rPr>
+          <w:b/>
+          <w:sz w:val="28"/>
+        </w:rPr>
         <w:t xml:space="preserve">qué</w:t>
       </w:r>
       <w:r>
+        <w:rPr>
+          <w:b/>
+          <w:sz w:val="28"/>
+        </w:rPr>
         <w:t xml:space="preserve"> </w:t>
       </w:r>
       <w:r>
+        <w:rPr>
+          <w:b/>
+          <w:sz w:val="28"/>
+        </w:rPr>
         <w:t xml:space="preserve">hicimos</w:t>
       </w:r>
       <w:r>
+        <w:rPr>
+          <w:b/>
+          <w:sz w:val="28"/>
+        </w:rPr>
         <w:t xml:space="preserve"> </w:t>
       </w:r>
       <w:r>
+        <w:rPr>
+          <w:b/>
+          <w:sz w:val="28"/>
+        </w:rPr>
         <w:t xml:space="preserve">y</w:t>
       </w:r>
       <w:r>
+        <w:rPr>
+          <w:b/>
+          <w:sz w:val="28"/>
+        </w:rPr>
         <w:t xml:space="preserve"> </w:t>
       </w:r>
       <w:r>
+        <w:rPr>
+          <w:b/>
+          <w:sz w:val="28"/>
+        </w:rPr>
         <w:t xml:space="preserve">qué</w:t>
       </w:r>
       <w:r>
+        <w:rPr>
+          <w:b/>
+          <w:sz w:val="28"/>
+        </w:rPr>
         <w:t xml:space="preserve"> </w:t>
       </w:r>
       <w:r>
+        <w:rPr>
+          <w:b/>
+          <w:sz w:val="28"/>
+        </w:rPr>
         <w:t xml:space="preserve">encontramos</w:t>
       </w:r>
     </w:p>
     <w:p>
       <w:pPr>
         <w:pStyle w:val="Author"/>
+        <w:jc w:val="center"/>
       </w:pPr>
       <w:r>
         <w:t xml:space="preserve">Thiago</w:t>
@@ -81,6 +159,7 @@
     <w:p>
       <w:pPr>
         <w:pStyle w:val="Date"/>
+        <w:jc w:val="center"/>
       </w:pPr>
       <w:r>
         <w:t xml:space="preserve">17</w:t>
@@ -188,286 +267,517 @@
     <w:tbl>
       <w:tblPr>
         <w:tblStyle w:val="Table"/>
-        <w:tblW w:type="pct" w:w="5000.0"/>
         <w:tblLook w:firstRow="1" w:lastRow="0" w:firstColumn="0" w:lastColumn="0" w:noHBand="0" w:noVBand="0" w:val="0020"/>
+        <w:tblW w:w="9070" w:type="dxa"/>
+        <w:tblLayout w:type="fixed"/>
+        <w:tblBorders>
+          <w:top w:val="single" w:sz="12" w:space="0" w:color="000000"/>
+          <w:bottom w:val="single" w:sz="12" w:space="0" w:color="000000"/>
+        </w:tblBorders>
+        <w:tblCellMar>
+          <w:left w:w="40" w:type="dxa"/>
+          <w:right w:w="40" w:type="dxa"/>
+        </w:tblCellMar>
       </w:tblPr>
       <w:tblGrid>
-        <w:gridCol w:w="1980"/>
-        <w:gridCol w:w="1980"/>
-        <w:gridCol w:w="1980"/>
-        <w:gridCol w:w="1980"/>
+        <w:gridCol w:w="2267"/>
+        <w:gridCol w:w="2267"/>
+        <w:gridCol w:w="2267"/>
+        <w:gridCol w:w="2267"/>
       </w:tblGrid>
       <w:tr>
-        <w:tc>
-          <w:p>
-            <w:pPr>
-              <w:pStyle w:val="Compact"/>
-              <w:jc w:val="left"/>
-            </w:pPr>
-            <w:r>
+        <w:trPr>
+          <w:cantSplit/>
+        </w:trPr>
+        <w:tc>
+          <w:tcPr>
+            <w:tcW w:w="2267" w:type="dxa"/>
+            <w:tcBorders>
+              <w:bottom w:val="single" w:sz="8" w:space="0" w:color="000000"/>
+            </w:tcBorders>
+          </w:tcPr>
+          <w:p>
+            <w:pPr>
+              <w:pStyle w:val="Compact"/>
+              <w:keepNext/>
+              <w:spacing w:before="20" w:after="20"/>
+              <w:jc w:val="left"/>
+            </w:pPr>
+            <w:r>
+              <w:rPr>
+                <w:b/>
+                <w:sz w:val="20"/>
+              </w:rPr>
               <w:t xml:space="preserve">Métrica</w:t>
             </w:r>
           </w:p>
         </w:tc>
         <w:tc>
-          <w:p>
-            <w:pPr>
-              <w:pStyle w:val="Compact"/>
-              <w:jc w:val="left"/>
-            </w:pPr>
-            <w:r>
+          <w:tcPr>
+            <w:tcW w:w="2267" w:type="dxa"/>
+            <w:tcBorders>
+              <w:bottom w:val="single" w:sz="8" w:space="0" w:color="000000"/>
+            </w:tcBorders>
+          </w:tcPr>
+          <w:p>
+            <w:pPr>
+              <w:pStyle w:val="Compact"/>
+              <w:keepNext/>
+              <w:spacing w:before="20" w:after="20"/>
+              <w:jc w:val="left"/>
+            </w:pPr>
+            <w:r>
+              <w:rPr>
+                <w:b/>
+                <w:sz w:val="20"/>
+              </w:rPr>
               <w:t xml:space="preserve">Qué mide</w:t>
             </w:r>
           </w:p>
         </w:tc>
         <w:tc>
-          <w:p>
-            <w:pPr>
-              <w:pStyle w:val="Compact"/>
-              <w:jc w:val="left"/>
-            </w:pPr>
-            <w:r>
+          <w:tcPr>
+            <w:tcW w:w="2267" w:type="dxa"/>
+            <w:tcBorders>
+              <w:bottom w:val="single" w:sz="8" w:space="0" w:color="000000"/>
+            </w:tcBorders>
+          </w:tcPr>
+          <w:p>
+            <w:pPr>
+              <w:pStyle w:val="Compact"/>
+              <w:keepNext/>
+              <w:spacing w:before="20" w:after="20"/>
+              <w:jc w:val="left"/>
+            </w:pPr>
+            <w:r>
+              <w:rPr>
+                <w:b/>
+                <w:sz w:val="20"/>
+              </w:rPr>
               <w:t xml:space="preserve">Sesión</w:t>
             </w:r>
           </w:p>
         </w:tc>
         <w:tc>
-          <w:p>
-            <w:pPr>
-              <w:pStyle w:val="Compact"/>
-              <w:jc w:val="left"/>
-            </w:pPr>
-            <w:r>
+          <w:tcPr>
+            <w:tcW w:w="2267" w:type="dxa"/>
+            <w:tcBorders>
+              <w:bottom w:val="single" w:sz="8" w:space="0" w:color="000000"/>
+            </w:tcBorders>
+          </w:tcPr>
+          <w:p>
+            <w:pPr>
+              <w:pStyle w:val="Compact"/>
+              <w:keepNext/>
+              <w:spacing w:before="20" w:after="20"/>
+              <w:jc w:val="left"/>
+            </w:pPr>
+            <w:r>
+              <w:rPr>
+                <w:b/>
+                <w:sz w:val="20"/>
+              </w:rPr>
               <w:t xml:space="preserve">De dónde sale</w:t>
             </w:r>
           </w:p>
         </w:tc>
       </w:tr>
       <w:tr>
-        <w:tc>
-          <w:p>
-            <w:pPr>
-              <w:pStyle w:val="Compact"/>
-              <w:jc w:val="left"/>
-            </w:pPr>
-            <w:r>
+        <w:trPr>
+          <w:cantSplit/>
+        </w:trPr>
+        <w:tc>
+          <w:tcPr>
+            <w:tcW w:w="2267" w:type="dxa"/>
+          </w:tcPr>
+          <w:p>
+            <w:pPr>
+              <w:pStyle w:val="Compact"/>
+              <w:keepNext/>
+              <w:spacing w:before="20" w:after="20"/>
+              <w:jc w:val="left"/>
+            </w:pPr>
+            <w:r>
+              <w:rPr>
+                <w:sz w:val="20"/>
+              </w:rPr>
               <w:t xml:space="preserve">A1 (s)</w:t>
             </w:r>
           </w:p>
         </w:tc>
         <w:tc>
-          <w:p>
-            <w:pPr>
-              <w:pStyle w:val="Compact"/>
-              <w:jc w:val="left"/>
-            </w:pPr>
-            <w:r>
+          <w:tcPr>
+            <w:tcW w:w="2267" w:type="dxa"/>
+          </w:tcPr>
+          <w:p>
+            <w:pPr>
+              <w:pStyle w:val="Compact"/>
+              <w:keepNext/>
+              <w:spacing w:before="20" w:after="20"/>
+              <w:jc w:val="left"/>
+            </w:pPr>
+            <w:r>
+              <w:rPr>
+                <w:sz w:val="20"/>
+              </w:rPr>
               <w:t xml:space="preserve">Tiempo explorando el objeto que después queda en su lugar</w:t>
             </w:r>
           </w:p>
         </w:tc>
         <w:tc>
-          <w:p>
-            <w:pPr>
-              <w:pStyle w:val="Compact"/>
-              <w:jc w:val="left"/>
-            </w:pPr>
-            <w:r>
+          <w:tcPr>
+            <w:tcW w:w="2267" w:type="dxa"/>
+          </w:tcPr>
+          <w:p>
+            <w:pPr>
+              <w:pStyle w:val="Compact"/>
+              <w:keepNext/>
+              <w:spacing w:before="20" w:after="20"/>
+              <w:jc w:val="left"/>
+            </w:pPr>
+            <w:r>
+              <w:rPr>
+                <w:sz w:val="20"/>
+              </w:rPr>
               <w:t xml:space="preserve">Día 1 (muestreo)</w:t>
             </w:r>
           </w:p>
         </w:tc>
         <w:tc>
-          <w:p>
-            <w:pPr>
-              <w:pStyle w:val="Compact"/>
-              <w:jc w:val="left"/>
-            </w:pPr>
-            <w:r>
+          <w:tcPr>
+            <w:tcW w:w="2267" w:type="dxa"/>
+          </w:tcPr>
+          <w:p>
+            <w:pPr>
+              <w:pStyle w:val="Compact"/>
+              <w:keepNext/>
+              <w:spacing w:before="20" w:after="20"/>
+              <w:jc w:val="left"/>
+            </w:pPr>
+            <w:r>
+              <w:rPr>
+                <w:sz w:val="20"/>
+              </w:rPr>
               <w:t xml:space="preserve">SLR_Dia1_exploracion_distancia_por_grupo.xlsx</w:t>
             </w:r>
           </w:p>
         </w:tc>
       </w:tr>
       <w:tr>
-        <w:tc>
-          <w:p>
-            <w:pPr>
-              <w:pStyle w:val="Compact"/>
-              <w:jc w:val="left"/>
-            </w:pPr>
-            <w:r>
+        <w:trPr>
+          <w:cantSplit/>
+        </w:trPr>
+        <w:tc>
+          <w:tcPr>
+            <w:tcW w:w="2267" w:type="dxa"/>
+          </w:tcPr>
+          <w:p>
+            <w:pPr>
+              <w:pStyle w:val="Compact"/>
+              <w:keepNext/>
+              <w:spacing w:before="20" w:after="20"/>
+              <w:jc w:val="left"/>
+            </w:pPr>
+            <w:r>
+              <w:rPr>
+                <w:sz w:val="20"/>
+              </w:rPr>
               <w:t xml:space="preserve">A2 (s)</w:t>
             </w:r>
           </w:p>
         </w:tc>
         <w:tc>
-          <w:p>
-            <w:pPr>
-              <w:pStyle w:val="Compact"/>
-              <w:jc w:val="left"/>
-            </w:pPr>
-            <w:r>
+          <w:tcPr>
+            <w:tcW w:w="2267" w:type="dxa"/>
+          </w:tcPr>
+          <w:p>
+            <w:pPr>
+              <w:pStyle w:val="Compact"/>
+              <w:keepNext/>
+              <w:spacing w:before="20" w:after="20"/>
+              <w:jc w:val="left"/>
+            </w:pPr>
+            <w:r>
+              <w:rPr>
+                <w:sz w:val="20"/>
+              </w:rPr>
               <w:t xml:space="preserve">Tiempo explorando el segundo objeto</w:t>
             </w:r>
           </w:p>
         </w:tc>
         <w:tc>
-          <w:p>
-            <w:pPr>
-              <w:pStyle w:val="Compact"/>
-              <w:jc w:val="left"/>
-            </w:pPr>
-            <w:r>
+          <w:tcPr>
+            <w:tcW w:w="2267" w:type="dxa"/>
+          </w:tcPr>
+          <w:p>
+            <w:pPr>
+              <w:pStyle w:val="Compact"/>
+              <w:keepNext/>
+              <w:spacing w:before="20" w:after="20"/>
+              <w:jc w:val="left"/>
+            </w:pPr>
+            <w:r>
+              <w:rPr>
+                <w:sz w:val="20"/>
+              </w:rPr>
               <w:t xml:space="preserve">Día 1 (muestreo)</w:t>
             </w:r>
           </w:p>
         </w:tc>
         <w:tc>
-          <w:p>
-            <w:pPr>
-              <w:pStyle w:val="Compact"/>
-              <w:jc w:val="left"/>
-            </w:pPr>
-            <w:r>
+          <w:tcPr>
+            <w:tcW w:w="2267" w:type="dxa"/>
+          </w:tcPr>
+          <w:p>
+            <w:pPr>
+              <w:pStyle w:val="Compact"/>
+              <w:keepNext/>
+              <w:spacing w:before="20" w:after="20"/>
+              <w:jc w:val="left"/>
+            </w:pPr>
+            <w:r>
+              <w:rPr>
+                <w:sz w:val="20"/>
+              </w:rPr>
               <w:t xml:space="preserve">El mismo archivo</w:t>
             </w:r>
           </w:p>
         </w:tc>
       </w:tr>
       <w:tr>
-        <w:tc>
-          <w:p>
-            <w:pPr>
-              <w:pStyle w:val="Compact"/>
-              <w:jc w:val="left"/>
-            </w:pPr>
-            <w:r>
+        <w:trPr>
+          <w:cantSplit/>
+        </w:trPr>
+        <w:tc>
+          <w:tcPr>
+            <w:tcW w:w="2267" w:type="dxa"/>
+          </w:tcPr>
+          <w:p>
+            <w:pPr>
+              <w:pStyle w:val="Compact"/>
+              <w:keepNext/>
+              <w:spacing w:before="20" w:after="20"/>
+              <w:jc w:val="left"/>
+            </w:pPr>
+            <w:r>
+              <w:rPr>
+                <w:sz w:val="20"/>
+              </w:rPr>
               <w:t xml:space="preserve">A3 (s)</w:t>
             </w:r>
           </w:p>
         </w:tc>
         <w:tc>
-          <w:p>
-            <w:pPr>
-              <w:pStyle w:val="Compact"/>
-              <w:jc w:val="left"/>
-            </w:pPr>
-            <w:r>
+          <w:tcPr>
+            <w:tcW w:w="2267" w:type="dxa"/>
+          </w:tcPr>
+          <w:p>
+            <w:pPr>
+              <w:pStyle w:val="Compact"/>
+              <w:keepNext/>
+              <w:spacing w:before="20" w:after="20"/>
+              <w:jc w:val="left"/>
+            </w:pPr>
+            <w:r>
+              <w:rPr>
+                <w:sz w:val="20"/>
+              </w:rPr>
               <w:t xml:space="preserve">Tiempo explorando el tercer objeto</w:t>
             </w:r>
           </w:p>
         </w:tc>
         <w:tc>
-          <w:p>
-            <w:pPr>
-              <w:pStyle w:val="Compact"/>
-              <w:jc w:val="left"/>
-            </w:pPr>
-            <w:r>
+          <w:tcPr>
+            <w:tcW w:w="2267" w:type="dxa"/>
+          </w:tcPr>
+          <w:p>
+            <w:pPr>
+              <w:pStyle w:val="Compact"/>
+              <w:keepNext/>
+              <w:spacing w:before="20" w:after="20"/>
+              <w:jc w:val="left"/>
+            </w:pPr>
+            <w:r>
+              <w:rPr>
+                <w:sz w:val="20"/>
+              </w:rPr>
               <w:t xml:space="preserve">Día 1 (muestreo)</w:t>
             </w:r>
           </w:p>
         </w:tc>
         <w:tc>
-          <w:p>
-            <w:pPr>
-              <w:pStyle w:val="Compact"/>
-              <w:jc w:val="left"/>
-            </w:pPr>
-            <w:r>
+          <w:tcPr>
+            <w:tcW w:w="2267" w:type="dxa"/>
+          </w:tcPr>
+          <w:p>
+            <w:pPr>
+              <w:pStyle w:val="Compact"/>
+              <w:keepNext/>
+              <w:spacing w:before="20" w:after="20"/>
+              <w:jc w:val="left"/>
+            </w:pPr>
+            <w:r>
+              <w:rPr>
+                <w:sz w:val="20"/>
+              </w:rPr>
               <w:t xml:space="preserve">El mismo archivo</w:t>
             </w:r>
           </w:p>
         </w:tc>
       </w:tr>
       <w:tr>
-        <w:tc>
-          <w:p>
-            <w:pPr>
-              <w:pStyle w:val="Compact"/>
-              <w:jc w:val="left"/>
-            </w:pPr>
-            <w:r>
+        <w:trPr>
+          <w:cantSplit/>
+        </w:trPr>
+        <w:tc>
+          <w:tcPr>
+            <w:tcW w:w="2267" w:type="dxa"/>
+          </w:tcPr>
+          <w:p>
+            <w:pPr>
+              <w:pStyle w:val="Compact"/>
+              <w:keepNext/>
+              <w:spacing w:before="20" w:after="20"/>
+              <w:jc w:val="left"/>
+            </w:pPr>
+            <w:r>
+              <w:rPr>
+                <w:sz w:val="20"/>
+              </w:rPr>
               <w:t xml:space="preserve">Exploración total (s)</w:t>
             </w:r>
           </w:p>
         </w:tc>
         <w:tc>
-          <w:p>
-            <w:pPr>
-              <w:pStyle w:val="Compact"/>
-              <w:jc w:val="left"/>
-            </w:pPr>
-            <w:r>
+          <w:tcPr>
+            <w:tcW w:w="2267" w:type="dxa"/>
+          </w:tcPr>
+          <w:p>
+            <w:pPr>
+              <w:pStyle w:val="Compact"/>
+              <w:keepNext/>
+              <w:spacing w:before="20" w:after="20"/>
+              <w:jc w:val="left"/>
+            </w:pPr>
+            <w:r>
+              <w:rPr>
+                <w:sz w:val="20"/>
+              </w:rPr>
               <w:t xml:space="preserve">Tiempo explorando los dos objetos</w:t>
             </w:r>
           </w:p>
         </w:tc>
         <w:tc>
-          <w:p>
-            <w:pPr>
-              <w:pStyle w:val="Compact"/>
-              <w:jc w:val="left"/>
-            </w:pPr>
-            <w:r>
+          <w:tcPr>
+            <w:tcW w:w="2267" w:type="dxa"/>
+          </w:tcPr>
+          <w:p>
+            <w:pPr>
+              <w:pStyle w:val="Compact"/>
+              <w:keepNext/>
+              <w:spacing w:before="20" w:after="20"/>
+              <w:jc w:val="left"/>
+            </w:pPr>
+            <w:r>
+              <w:rPr>
+                <w:sz w:val="20"/>
+              </w:rPr>
               <w:t xml:space="preserve">Día 2 (prueba)</w:t>
             </w:r>
           </w:p>
         </w:tc>
         <w:tc>
-          <w:p>
-            <w:pPr>
-              <w:pStyle w:val="Compact"/>
-              <w:jc w:val="left"/>
-            </w:pPr>
-            <w:r>
+          <w:tcPr>
+            <w:tcW w:w="2267" w:type="dxa"/>
+          </w:tcPr>
+          <w:p>
+            <w:pPr>
+              <w:pStyle w:val="Compact"/>
+              <w:keepNext/>
+              <w:spacing w:before="20" w:after="20"/>
+              <w:jc w:val="left"/>
+            </w:pPr>
+            <w:r>
+              <w:rPr>
+                <w:sz w:val="20"/>
+              </w:rPr>
               <w:t xml:space="preserve">SLR_exploracion_D1_vs_D2 actualizado.xlsx</w:t>
             </w:r>
           </w:p>
         </w:tc>
       </w:tr>
       <w:tr>
-        <w:tc>
-          <w:p>
-            <w:pPr>
-              <w:pStyle w:val="Compact"/>
-              <w:jc w:val="left"/>
-            </w:pPr>
-            <w:r>
+        <w:trPr>
+          <w:cantSplit/>
+        </w:trPr>
+        <w:tc>
+          <w:tcPr>
+            <w:tcW w:w="2267" w:type="dxa"/>
+          </w:tcPr>
+          <w:p>
+            <w:pPr>
+              <w:pStyle w:val="Compact"/>
+              <w:spacing w:before="20" w:after="20"/>
+              <w:jc w:val="left"/>
+            </w:pPr>
+            <w:r>
+              <w:rPr>
+                <w:sz w:val="20"/>
+              </w:rPr>
               <w:t xml:space="preserve">DI</w:t>
             </w:r>
           </w:p>
         </w:tc>
         <w:tc>
-          <w:p>
-            <w:pPr>
-              <w:pStyle w:val="Compact"/>
-              <w:jc w:val="left"/>
-            </w:pPr>
-            <w:r>
+          <w:tcPr>
+            <w:tcW w:w="2267" w:type="dxa"/>
+          </w:tcPr>
+          <w:p>
+            <w:pPr>
+              <w:pStyle w:val="Compact"/>
+              <w:spacing w:before="20" w:after="20"/>
+              <w:jc w:val="left"/>
+            </w:pPr>
+            <w:r>
+              <w:rPr>
+                <w:sz w:val="20"/>
+              </w:rPr>
               <w:t xml:space="preserve">Cuánto prefirió la posición nueva sobre la familiar</w:t>
             </w:r>
           </w:p>
         </w:tc>
         <w:tc>
-          <w:p>
-            <w:pPr>
-              <w:pStyle w:val="Compact"/>
-              <w:jc w:val="left"/>
-            </w:pPr>
-            <w:r>
+          <w:tcPr>
+            <w:tcW w:w="2267" w:type="dxa"/>
+          </w:tcPr>
+          <w:p>
+            <w:pPr>
+              <w:pStyle w:val="Compact"/>
+              <w:spacing w:before="20" w:after="20"/>
+              <w:jc w:val="left"/>
+            </w:pPr>
+            <w:r>
+              <w:rPr>
+                <w:sz w:val="20"/>
+              </w:rPr>
               <w:t xml:space="preserve">Día 2 (prueba)</w:t>
             </w:r>
           </w:p>
         </w:tc>
         <w:tc>
-          <w:p>
-            <w:pPr>
-              <w:pStyle w:val="Compact"/>
-              <w:jc w:val="left"/>
-            </w:pPr>
-            <w:r>
+          <w:tcPr>
+            <w:tcW w:w="2267" w:type="dxa"/>
+          </w:tcPr>
+          <w:p>
+            <w:pPr>
+              <w:pStyle w:val="Compact"/>
+              <w:spacing w:before="20" w:after="20"/>
+              <w:jc w:val="left"/>
+            </w:pPr>
+            <w:r>
+              <w:rPr>
+                <w:sz w:val="20"/>
+              </w:rPr>
               <w:t xml:space="preserve">Hoja ORIGEN de SLR PRISMA RESULTADOS.xlsx</w:t>
             </w:r>
           </w:p>
@@ -616,206 +926,379 @@
     <w:tbl>
       <w:tblPr>
         <w:tblStyle w:val="Table"/>
-        <w:tblW w:type="pct" w:w="5000.0"/>
         <w:tblLook w:firstRow="1" w:lastRow="0" w:firstColumn="0" w:lastColumn="0" w:noHBand="0" w:noVBand="0" w:val="0020"/>
+        <w:tblW w:w="9070" w:type="dxa"/>
+        <w:tblLayout w:type="fixed"/>
+        <w:tblBorders>
+          <w:top w:val="single" w:sz="12" w:space="0" w:color="000000"/>
+          <w:bottom w:val="single" w:sz="12" w:space="0" w:color="000000"/>
+        </w:tblBorders>
+        <w:tblCellMar>
+          <w:left w:w="40" w:type="dxa"/>
+          <w:right w:w="40" w:type="dxa"/>
+        </w:tblCellMar>
       </w:tblPr>
       <w:tblGrid>
-        <w:gridCol w:w="1980"/>
-        <w:gridCol w:w="1980"/>
-        <w:gridCol w:w="1980"/>
-        <w:gridCol w:w="1980"/>
+        <w:gridCol w:w="2267"/>
+        <w:gridCol w:w="2267"/>
+        <w:gridCol w:w="2267"/>
+        <w:gridCol w:w="2267"/>
       </w:tblGrid>
       <w:tr>
-        <w:tc>
-          <w:p>
-            <w:pPr>
-              <w:pStyle w:val="Compact"/>
-              <w:jc w:val="left"/>
-            </w:pPr>
-            <w:r>
+        <w:trPr>
+          <w:cantSplit/>
+        </w:trPr>
+        <w:tc>
+          <w:tcPr>
+            <w:tcW w:w="2267" w:type="dxa"/>
+            <w:tcBorders>
+              <w:bottom w:val="single" w:sz="8" w:space="0" w:color="000000"/>
+            </w:tcBorders>
+          </w:tcPr>
+          <w:p>
+            <w:pPr>
+              <w:pStyle w:val="Compact"/>
+              <w:keepNext/>
+              <w:spacing w:before="20" w:after="20"/>
+              <w:jc w:val="left"/>
+            </w:pPr>
+            <w:r>
+              <w:rPr>
+                <w:b/>
+                <w:sz w:val="20"/>
+              </w:rPr>
               <w:t xml:space="preserve">Método</w:t>
             </w:r>
           </w:p>
         </w:tc>
         <w:tc>
-          <w:p>
-            <w:pPr>
-              <w:pStyle w:val="Compact"/>
-              <w:jc w:val="left"/>
-            </w:pPr>
-            <w:r>
+          <w:tcPr>
+            <w:tcW w:w="2267" w:type="dxa"/>
+            <w:tcBorders>
+              <w:bottom w:val="single" w:sz="8" w:space="0" w:color="000000"/>
+            </w:tcBorders>
+          </w:tcPr>
+          <w:p>
+            <w:pPr>
+              <w:pStyle w:val="Compact"/>
+              <w:keepNext/>
+              <w:spacing w:before="20" w:after="20"/>
+              <w:jc w:val="left"/>
+            </w:pPr>
+            <w:r>
+              <w:rPr>
+                <w:b/>
+                <w:sz w:val="20"/>
+              </w:rPr>
               <w:t xml:space="preserve">Pregunta que responde</w:t>
             </w:r>
           </w:p>
         </w:tc>
         <w:tc>
-          <w:p>
-            <w:pPr>
-              <w:pStyle w:val="Compact"/>
-              <w:jc w:val="left"/>
-            </w:pPr>
-            <w:r>
+          <w:tcPr>
+            <w:tcW w:w="2267" w:type="dxa"/>
+            <w:tcBorders>
+              <w:bottom w:val="single" w:sz="8" w:space="0" w:color="000000"/>
+            </w:tcBorders>
+          </w:tcPr>
+          <w:p>
+            <w:pPr>
+              <w:pStyle w:val="Compact"/>
+              <w:keepNext/>
+              <w:spacing w:before="20" w:after="20"/>
+              <w:jc w:val="left"/>
+            </w:pPr>
+            <w:r>
+              <w:rPr>
+                <w:b/>
+                <w:sz w:val="20"/>
+              </w:rPr>
               <w:t xml:space="preserve">Cómo funciona</w:t>
             </w:r>
           </w:p>
         </w:tc>
         <w:tc>
-          <w:p>
-            <w:pPr>
-              <w:pStyle w:val="Compact"/>
-              <w:jc w:val="left"/>
-            </w:pPr>
-            <w:r>
+          <w:tcPr>
+            <w:tcW w:w="2267" w:type="dxa"/>
+            <w:tcBorders>
+              <w:bottom w:val="single" w:sz="8" w:space="0" w:color="000000"/>
+            </w:tcBorders>
+          </w:tcPr>
+          <w:p>
+            <w:pPr>
+              <w:pStyle w:val="Compact"/>
+              <w:keepNext/>
+              <w:spacing w:before="20" w:after="20"/>
+              <w:jc w:val="left"/>
+            </w:pPr>
+            <w:r>
+              <w:rPr>
+                <w:b/>
+                <w:sz w:val="20"/>
+              </w:rPr>
               <w:t xml:space="preserve">Cómo se lee el resultado</w:t>
             </w:r>
           </w:p>
         </w:tc>
       </w:tr>
       <w:tr>
-        <w:tc>
-          <w:p>
-            <w:pPr>
-              <w:pStyle w:val="Compact"/>
-              <w:jc w:val="left"/>
-            </w:pPr>
-            <w:r>
+        <w:trPr>
+          <w:cantSplit/>
+        </w:trPr>
+        <w:tc>
+          <w:tcPr>
+            <w:tcW w:w="2267" w:type="dxa"/>
+          </w:tcPr>
+          <w:p>
+            <w:pPr>
+              <w:pStyle w:val="Compact"/>
+              <w:keepNext/>
+              <w:spacing w:before="20" w:after="20"/>
+              <w:jc w:val="left"/>
+            </w:pPr>
+            <w:r>
+              <w:rPr>
+                <w:sz w:val="20"/>
+              </w:rPr>
               <w:t xml:space="preserve">PCA (análisis de componentes principales)</w:t>
             </w:r>
           </w:p>
         </w:tc>
         <w:tc>
-          <w:p>
-            <w:pPr>
-              <w:pStyle w:val="Compact"/>
-              <w:jc w:val="left"/>
-            </w:pPr>
-            <w:r>
+          <w:tcPr>
+            <w:tcW w:w="2267" w:type="dxa"/>
+          </w:tcPr>
+          <w:p>
+            <w:pPr>
+              <w:pStyle w:val="Compact"/>
+              <w:keepNext/>
+              <w:spacing w:before="20" w:after="20"/>
+              <w:jc w:val="left"/>
+            </w:pPr>
+            <w:r>
+              <w:rPr>
+                <w:sz w:val="20"/>
+              </w:rPr>
               <w:t xml:space="preserve">¿Qué métricas varían juntas y cuántas dimensiones hay de verdad en los datos?</w:t>
             </w:r>
           </w:p>
         </w:tc>
         <w:tc>
-          <w:p>
-            <w:pPr>
-              <w:pStyle w:val="Compact"/>
-              <w:jc w:val="left"/>
-            </w:pPr>
-            <w:r>
+          <w:tcPr>
+            <w:tcW w:w="2267" w:type="dxa"/>
+          </w:tcPr>
+          <w:p>
+            <w:pPr>
+              <w:pStyle w:val="Compact"/>
+              <w:keepNext/>
+              <w:spacing w:before="20" w:after="20"/>
+              <w:jc w:val="left"/>
+            </w:pPr>
+            <w:r>
+              <w:rPr>
+                <w:sz w:val="20"/>
+              </w:rPr>
               <w:t xml:space="preserve">Resume las cinco métricas en unas pocas combinaciones nuevas, llamadas componentes, que no están correlacionadas entre sí. La primera concentra la mayor parte de la variación entre animales; la segunda, la que sigue.</w:t>
             </w:r>
           </w:p>
         </w:tc>
         <w:tc>
-          <w:p>
-            <w:pPr>
-              <w:pStyle w:val="Compact"/>
-              <w:jc w:val="left"/>
-            </w:pPr>
-            <w:r>
+          <w:tcPr>
+            <w:tcW w:w="2267" w:type="dxa"/>
+          </w:tcPr>
+          <w:p>
+            <w:pPr>
+              <w:pStyle w:val="Compact"/>
+              <w:keepNext/>
+              <w:spacing w:before="20" w:after="20"/>
+              <w:jc w:val="left"/>
+            </w:pPr>
+            <w:r>
+              <w:rPr>
+                <w:sz w:val="20"/>
+              </w:rPr>
               <w:t xml:space="preserve">El porcentaje de cada componente dice cuánta información resume. Las cargas dicen qué métricas la forman. Cada animal queda como un punto: los animales parecidos quedan cerca.</w:t>
             </w:r>
           </w:p>
         </w:tc>
       </w:tr>
       <w:tr>
-        <w:tc>
-          <w:p>
-            <w:pPr>
-              <w:pStyle w:val="Compact"/>
-              <w:jc w:val="left"/>
-            </w:pPr>
-            <w:r>
+        <w:trPr>
+          <w:cantSplit/>
+        </w:trPr>
+        <w:tc>
+          <w:tcPr>
+            <w:tcW w:w="2267" w:type="dxa"/>
+          </w:tcPr>
+          <w:p>
+            <w:pPr>
+              <w:pStyle w:val="Compact"/>
+              <w:keepNext/>
+              <w:spacing w:before="20" w:after="20"/>
+              <w:jc w:val="left"/>
+            </w:pPr>
+            <w:r>
+              <w:rPr>
+                <w:sz w:val="20"/>
+              </w:rPr>
               <w:t xml:space="preserve">Clustering de Ward</w:t>
             </w:r>
           </w:p>
         </w:tc>
         <w:tc>
-          <w:p>
-            <w:pPr>
-              <w:pStyle w:val="Compact"/>
-              <w:jc w:val="left"/>
-            </w:pPr>
-            <w:r>
+          <w:tcPr>
+            <w:tcW w:w="2267" w:type="dxa"/>
+          </w:tcPr>
+          <w:p>
+            <w:pPr>
+              <w:pStyle w:val="Compact"/>
+              <w:keepNext/>
+              <w:spacing w:before="20" w:after="20"/>
+              <w:jc w:val="left"/>
+            </w:pPr>
+            <w:r>
+              <w:rPr>
+                <w:sz w:val="20"/>
+              </w:rPr>
               <w:t xml:space="preserve">¿Los animales se separan solos en grupos que coincidan con la exposición?</w:t>
             </w:r>
           </w:p>
         </w:tc>
         <w:tc>
-          <w:p>
-            <w:pPr>
-              <w:pStyle w:val="Compact"/>
-              <w:jc w:val="left"/>
-            </w:pPr>
-            <w:r>
+          <w:tcPr>
+            <w:tcW w:w="2267" w:type="dxa"/>
+          </w:tcPr>
+          <w:p>
+            <w:pPr>
+              <w:pStyle w:val="Compact"/>
+              <w:keepNext/>
+              <w:spacing w:before="20" w:after="20"/>
+              <w:jc w:val="left"/>
+            </w:pPr>
+            <w:r>
+              <w:rPr>
+                <w:sz w:val="20"/>
+              </w:rPr>
               <w:t xml:space="preserve">No recibe a qué grupo pertenece cada animal. Junta primero los dos animales más parecidos, después los grupitos más parecidos, y así hasta tener un árbol.</w:t>
             </w:r>
           </w:p>
         </w:tc>
         <w:tc>
-          <w:p>
-            <w:pPr>
-              <w:pStyle w:val="Compact"/>
-              <w:jc w:val="left"/>
-            </w:pPr>
-            <w:r>
+          <w:tcPr>
+            <w:tcW w:w="2267" w:type="dxa"/>
+          </w:tcPr>
+          <w:p>
+            <w:pPr>
+              <w:pStyle w:val="Compact"/>
+              <w:keepNext/>
+              <w:spacing w:before="20" w:after="20"/>
+              <w:jc w:val="left"/>
+            </w:pPr>
+            <w:r>
+              <w:rPr>
+                <w:sz w:val="20"/>
+              </w:rPr>
               <w:t xml:space="preserve">La silueta (de −1 a 1) dice cuántos grupos naturales hay. El índice de Rand ajustado (ARI) dice cuánto coinciden esos grupos con los grupos reales: 0 es coincidencia al azar y 1, coincidencia perfecta.</w:t>
             </w:r>
           </w:p>
         </w:tc>
       </w:tr>
       <w:tr>
-        <w:tc>
-          <w:p>
-            <w:pPr>
-              <w:pStyle w:val="Compact"/>
-              <w:jc w:val="left"/>
-            </w:pPr>
-            <w:r>
+        <w:trPr>
+          <w:cantSplit/>
+        </w:trPr>
+        <w:tc>
+          <w:tcPr>
+            <w:tcW w:w="2267" w:type="dxa"/>
+          </w:tcPr>
+          <w:p>
+            <w:pPr>
+              <w:pStyle w:val="Compact"/>
+              <w:spacing w:before="20" w:after="20"/>
+              <w:jc w:val="left"/>
+            </w:pPr>
+            <w:r>
+              <w:rPr>
+                <w:sz w:val="20"/>
+              </w:rPr>
               <w:t xml:space="preserve">Random Forest</w:t>
             </w:r>
           </w:p>
         </w:tc>
         <w:tc>
-          <w:p>
-            <w:pPr>
-              <w:pStyle w:val="Compact"/>
-              <w:jc w:val="left"/>
-            </w:pPr>
-            <w:r>
+          <w:tcPr>
+            <w:tcW w:w="2267" w:type="dxa"/>
+          </w:tcPr>
+          <w:p>
+            <w:pPr>
+              <w:pStyle w:val="Compact"/>
+              <w:spacing w:before="20" w:after="20"/>
+              <w:jc w:val="left"/>
+            </w:pPr>
+            <w:r>
+              <w:rPr>
+                <w:sz w:val="20"/>
+              </w:rPr>
               <w:t xml:space="preserve">¿Las métricas alcanzan para reconocer el grupo de un animal que el modelo nunca vio?</w:t>
             </w:r>
           </w:p>
         </w:tc>
         <w:tc>
-          <w:p>
-            <w:pPr>
-              <w:pStyle w:val="Compact"/>
-              <w:jc w:val="left"/>
-            </w:pPr>
-            <w:r>
+          <w:tcPr>
+            <w:tcW w:w="2267" w:type="dxa"/>
+          </w:tcPr>
+          <w:p>
+            <w:pPr>
+              <w:pStyle w:val="Compact"/>
+              <w:spacing w:before="20" w:after="20"/>
+              <w:jc w:val="left"/>
+            </w:pPr>
+            <w:r>
+              <w:rPr>
+                <w:sz w:val="20"/>
+              </w:rPr>
               <w:t xml:space="preserve">Son cientos de árboles de decisión (</w:t>
             </w:r>
             <w:r>
+              <w:rPr>
+                <w:sz w:val="20"/>
+              </w:rPr>
               <w:t xml:space="preserve">“</w:t>
             </w:r>
             <w:r>
+              <w:rPr>
+                <w:sz w:val="20"/>
+              </w:rPr>
               <w:t xml:space="preserve">si el DI es menor que tanto y exploró más de tanto, entonces es de tal grupo</w:t>
             </w:r>
             <w:r>
+              <w:rPr>
+                <w:sz w:val="20"/>
+              </w:rPr>
               <w:t xml:space="preserve">”</w:t>
             </w:r>
             <w:r>
+              <w:rPr>
+                <w:sz w:val="20"/>
+              </w:rPr>
               <w:t xml:space="preserve">) que votan. Se entrena con animales de grupo conocido y se prueba con otros.</w:t>
             </w:r>
           </w:p>
         </w:tc>
         <w:tc>
-          <w:p>
-            <w:pPr>
-              <w:pStyle w:val="Compact"/>
-              <w:jc w:val="left"/>
-            </w:pPr>
-            <w:r>
+          <w:tcPr>
+            <w:tcW w:w="2267" w:type="dxa"/>
+          </w:tcPr>
+          <w:p>
+            <w:pPr>
+              <w:pStyle w:val="Compact"/>
+              <w:spacing w:before="20" w:after="20"/>
+              <w:jc w:val="left"/>
+            </w:pPr>
+            <w:r>
+              <w:rPr>
+                <w:sz w:val="20"/>
+              </w:rPr>
               <w:t xml:space="preserve">La exactitud balanceada es el promedio de aciertos de cada grupo; se compara con lo que acertaría el azar. La importancia de cada métrica es cuánto empeora el modelo si esa métrica se mezcla al azar.</w:t>
             </w:r>
           </w:p>
@@ -952,6 +1435,8 @@
     <w:p>
       <w:pPr>
         <w:pStyle w:val="BodyText"/>
+        <w:keepNext/>
+        <w:jc w:val="center"/>
       </w:pPr>
       <w:r>
         <w:drawing>
@@ -1105,378 +1590,679 @@
     <w:tbl>
       <w:tblPr>
         <w:tblStyle w:val="Table"/>
-        <w:tblW w:type="pct" w:w="5000.0"/>
         <w:tblLook w:firstRow="1" w:lastRow="0" w:firstColumn="0" w:lastColumn="0" w:noHBand="0" w:noVBand="0" w:val="0020"/>
+        <w:tblW w:w="9070" w:type="dxa"/>
+        <w:tblLayout w:type="fixed"/>
+        <w:tblBorders>
+          <w:top w:val="single" w:sz="12" w:space="0" w:color="000000"/>
+          <w:bottom w:val="single" w:sz="12" w:space="0" w:color="000000"/>
+        </w:tblBorders>
+        <w:tblCellMar>
+          <w:left w:w="40" w:type="dxa"/>
+          <w:right w:w="40" w:type="dxa"/>
+        </w:tblCellMar>
       </w:tblPr>
       <w:tblGrid>
-        <w:gridCol w:w="1980"/>
-        <w:gridCol w:w="1980"/>
-        <w:gridCol w:w="1980"/>
-        <w:gridCol w:w="1980"/>
+        <w:gridCol w:w="2267"/>
+        <w:gridCol w:w="2267"/>
+        <w:gridCol w:w="2267"/>
+        <w:gridCol w:w="2267"/>
       </w:tblGrid>
       <w:tr>
-        <w:tc>
-          <w:p>
-            <w:pPr>
-              <w:pStyle w:val="Compact"/>
-              <w:jc w:val="left"/>
-            </w:pPr>
-            <w:r>
+        <w:trPr>
+          <w:cantSplit/>
+        </w:trPr>
+        <w:tc>
+          <w:tcPr>
+            <w:tcW w:w="2267" w:type="dxa"/>
+            <w:tcBorders>
+              <w:bottom w:val="single" w:sz="8" w:space="0" w:color="000000"/>
+            </w:tcBorders>
+          </w:tcPr>
+          <w:p>
+            <w:pPr>
+              <w:pStyle w:val="Compact"/>
+              <w:keepNext/>
+              <w:spacing w:before="20" w:after="20"/>
+              <w:jc w:val="left"/>
+            </w:pPr>
+            <w:r>
+              <w:rPr>
+                <w:b/>
+                <w:sz w:val="20"/>
+              </w:rPr>
               <w:t xml:space="preserve">Pregunta al modelo</w:t>
             </w:r>
           </w:p>
         </w:tc>
         <w:tc>
-          <w:p>
-            <w:pPr>
-              <w:pStyle w:val="Compact"/>
-              <w:jc w:val="left"/>
-            </w:pPr>
-            <w:r>
+          <w:tcPr>
+            <w:tcW w:w="2267" w:type="dxa"/>
+            <w:tcBorders>
+              <w:bottom w:val="single" w:sz="8" w:space="0" w:color="000000"/>
+            </w:tcBorders>
+          </w:tcPr>
+          <w:p>
+            <w:pPr>
+              <w:pStyle w:val="Compact"/>
+              <w:keepNext/>
+              <w:spacing w:before="20" w:after="20"/>
+              <w:jc w:val="center"/>
+            </w:pPr>
+            <w:r>
+              <w:rPr>
+                <w:b/>
+                <w:sz w:val="20"/>
+              </w:rPr>
               <w:t xml:space="preserve">Aciertos (exactitud balanceada)</w:t>
             </w:r>
           </w:p>
         </w:tc>
         <w:tc>
-          <w:p>
-            <w:pPr>
-              <w:pStyle w:val="Compact"/>
-              <w:jc w:val="left"/>
-            </w:pPr>
-            <w:r>
+          <w:tcPr>
+            <w:tcW w:w="2267" w:type="dxa"/>
+            <w:tcBorders>
+              <w:bottom w:val="single" w:sz="8" w:space="0" w:color="000000"/>
+            </w:tcBorders>
+          </w:tcPr>
+          <w:p>
+            <w:pPr>
+              <w:pStyle w:val="Compact"/>
+              <w:keepNext/>
+              <w:spacing w:before="20" w:after="20"/>
+              <w:jc w:val="center"/>
+            </w:pPr>
+            <w:r>
+              <w:rPr>
+                <w:b/>
+                <w:sz w:val="20"/>
+              </w:rPr>
               <w:t xml:space="preserve">Por azar</w:t>
             </w:r>
           </w:p>
         </w:tc>
         <w:tc>
-          <w:p>
-            <w:pPr>
-              <w:pStyle w:val="Compact"/>
-              <w:jc w:val="left"/>
-            </w:pPr>
-            <w:r>
+          <w:tcPr>
+            <w:tcW w:w="2267" w:type="dxa"/>
+            <w:tcBorders>
+              <w:bottom w:val="single" w:sz="8" w:space="0" w:color="000000"/>
+            </w:tcBorders>
+          </w:tcPr>
+          <w:p>
+            <w:pPr>
+              <w:pStyle w:val="Compact"/>
+              <w:keepNext/>
+              <w:spacing w:before="20" w:after="20"/>
+              <w:jc w:val="center"/>
+            </w:pPr>
+            <w:r>
+              <w:rPr>
+                <w:b/>
+                <w:sz w:val="20"/>
+              </w:rPr>
               <w:t xml:space="preserve">p (permutación)</w:t>
             </w:r>
           </w:p>
         </w:tc>
       </w:tr>
       <w:tr>
-        <w:tc>
-          <w:p>
-            <w:pPr>
-              <w:pStyle w:val="Compact"/>
-              <w:jc w:val="left"/>
-            </w:pPr>
-            <w:r>
+        <w:trPr>
+          <w:cantSplit/>
+        </w:trPr>
+        <w:tc>
+          <w:tcPr>
+            <w:tcW w:w="2267" w:type="dxa"/>
+          </w:tcPr>
+          <w:p>
+            <w:pPr>
+              <w:pStyle w:val="Compact"/>
+              <w:keepNext/>
+              <w:spacing w:before="20" w:after="20"/>
+              <w:jc w:val="left"/>
+            </w:pPr>
+            <w:r>
+              <w:rPr>
+                <w:sz w:val="20"/>
+              </w:rPr>
               <w:t xml:space="preserve">¿Cuál de los 6 grupos?</w:t>
             </w:r>
           </w:p>
         </w:tc>
         <w:tc>
-          <w:p>
-            <w:pPr>
-              <w:pStyle w:val="Compact"/>
-              <w:jc w:val="left"/>
-            </w:pPr>
-            <w:r>
+          <w:tcPr>
+            <w:tcW w:w="2267" w:type="dxa"/>
+          </w:tcPr>
+          <w:p>
+            <w:pPr>
+              <w:pStyle w:val="Compact"/>
+              <w:keepNext/>
+              <w:spacing w:before="20" w:after="20"/>
+              <w:jc w:val="center"/>
+            </w:pPr>
+            <w:r>
+              <w:rPr>
+                <w:sz w:val="20"/>
+              </w:rPr>
               <w:t xml:space="preserve">0,30 ± 0,08</w:t>
             </w:r>
           </w:p>
         </w:tc>
         <w:tc>
-          <w:p>
-            <w:pPr>
-              <w:pStyle w:val="Compact"/>
-              <w:jc w:val="left"/>
-            </w:pPr>
-            <w:r>
+          <w:tcPr>
+            <w:tcW w:w="2267" w:type="dxa"/>
+          </w:tcPr>
+          <w:p>
+            <w:pPr>
+              <w:pStyle w:val="Compact"/>
+              <w:keepNext/>
+              <w:spacing w:before="20" w:after="20"/>
+              <w:jc w:val="center"/>
+            </w:pPr>
+            <w:r>
+              <w:rPr>
+                <w:sz w:val="20"/>
+              </w:rPr>
               <w:t xml:space="preserve">0,17</w:t>
             </w:r>
           </w:p>
         </w:tc>
         <w:tc>
-          <w:p>
-            <w:pPr>
-              <w:pStyle w:val="Compact"/>
-              <w:jc w:val="left"/>
-            </w:pPr>
-            <w:r>
+          <w:tcPr>
+            <w:tcW w:w="2267" w:type="dxa"/>
+          </w:tcPr>
+          <w:p>
+            <w:pPr>
+              <w:pStyle w:val="Compact"/>
+              <w:keepNext/>
+              <w:spacing w:before="20" w:after="20"/>
+              <w:jc w:val="center"/>
+            </w:pPr>
+            <w:r>
+              <w:rPr>
+                <w:sz w:val="20"/>
+              </w:rPr>
               <w:t xml:space="preserve">0,006</w:t>
             </w:r>
           </w:p>
         </w:tc>
       </w:tr>
       <w:tr>
-        <w:tc>
-          <w:p>
-            <w:pPr>
-              <w:pStyle w:val="Compact"/>
-              <w:jc w:val="left"/>
-            </w:pPr>
-            <w:r>
+        <w:trPr>
+          <w:cantSplit/>
+        </w:trPr>
+        <w:tc>
+          <w:tcPr>
+            <w:tcW w:w="2267" w:type="dxa"/>
+          </w:tcPr>
+          <w:p>
+            <w:pPr>
+              <w:pStyle w:val="Compact"/>
+              <w:keepNext/>
+              <w:spacing w:before="20" w:after="20"/>
+              <w:jc w:val="left"/>
+            </w:pPr>
+            <w:r>
+              <w:rPr>
+                <w:sz w:val="20"/>
+              </w:rPr>
               <w:t xml:space="preserve">¿Control o sacarosa?</w:t>
             </w:r>
           </w:p>
         </w:tc>
         <w:tc>
-          <w:p>
-            <w:pPr>
-              <w:pStyle w:val="Compact"/>
-              <w:jc w:val="left"/>
-            </w:pPr>
-            <w:r>
+          <w:tcPr>
+            <w:tcW w:w="2267" w:type="dxa"/>
+          </w:tcPr>
+          <w:p>
+            <w:pPr>
+              <w:pStyle w:val="Compact"/>
+              <w:keepNext/>
+              <w:spacing w:before="20" w:after="20"/>
+              <w:jc w:val="center"/>
+            </w:pPr>
+            <w:r>
+              <w:rPr>
+                <w:sz w:val="20"/>
+              </w:rPr>
               <w:t xml:space="preserve">0,67 ± 0,09</w:t>
             </w:r>
           </w:p>
         </w:tc>
         <w:tc>
-          <w:p>
-            <w:pPr>
-              <w:pStyle w:val="Compact"/>
-              <w:jc w:val="left"/>
-            </w:pPr>
-            <w:r>
+          <w:tcPr>
+            <w:tcW w:w="2267" w:type="dxa"/>
+          </w:tcPr>
+          <w:p>
+            <w:pPr>
+              <w:pStyle w:val="Compact"/>
+              <w:keepNext/>
+              <w:spacing w:before="20" w:after="20"/>
+              <w:jc w:val="center"/>
+            </w:pPr>
+            <w:r>
+              <w:rPr>
+                <w:sz w:val="20"/>
+              </w:rPr>
               <w:t xml:space="preserve">0,50</w:t>
             </w:r>
           </w:p>
         </w:tc>
         <w:tc>
-          <w:p>
-            <w:pPr>
-              <w:pStyle w:val="Compact"/>
-              <w:jc w:val="left"/>
-            </w:pPr>
-            <w:r>
+          <w:tcPr>
+            <w:tcW w:w="2267" w:type="dxa"/>
+          </w:tcPr>
+          <w:p>
+            <w:pPr>
+              <w:pStyle w:val="Compact"/>
+              <w:keepNext/>
+              <w:spacing w:before="20" w:after="20"/>
+              <w:jc w:val="center"/>
+            </w:pPr>
+            <w:r>
+              <w:rPr>
+                <w:sz w:val="20"/>
+              </w:rPr>
               <w:t xml:space="preserve">0,010</w:t>
             </w:r>
           </w:p>
         </w:tc>
       </w:tr>
       <w:tr>
-        <w:tc>
-          <w:p>
-            <w:pPr>
-              <w:pStyle w:val="Compact"/>
-              <w:jc w:val="left"/>
-            </w:pPr>
-            <w:r>
+        <w:trPr>
+          <w:cantSplit/>
+        </w:trPr>
+        <w:tc>
+          <w:tcPr>
+            <w:tcW w:w="2267" w:type="dxa"/>
+          </w:tcPr>
+          <w:p>
+            <w:pPr>
+              <w:pStyle w:val="Compact"/>
+              <w:keepNext/>
+              <w:spacing w:before="20" w:after="20"/>
+              <w:jc w:val="left"/>
+            </w:pPr>
+            <w:r>
+              <w:rPr>
+                <w:sz w:val="20"/>
+              </w:rPr>
               <w:t xml:space="preserve">¿Control o stevia?</w:t>
             </w:r>
           </w:p>
         </w:tc>
         <w:tc>
-          <w:p>
-            <w:pPr>
-              <w:pStyle w:val="Compact"/>
-              <w:jc w:val="left"/>
-            </w:pPr>
-            <w:r>
+          <w:tcPr>
+            <w:tcW w:w="2267" w:type="dxa"/>
+          </w:tcPr>
+          <w:p>
+            <w:pPr>
+              <w:pStyle w:val="Compact"/>
+              <w:keepNext/>
+              <w:spacing w:before="20" w:after="20"/>
+              <w:jc w:val="center"/>
+            </w:pPr>
+            <w:r>
+              <w:rPr>
+                <w:sz w:val="20"/>
+              </w:rPr>
               <w:t xml:space="preserve">0,67 ± 0,10</w:t>
             </w:r>
           </w:p>
         </w:tc>
         <w:tc>
-          <w:p>
-            <w:pPr>
-              <w:pStyle w:val="Compact"/>
-              <w:jc w:val="left"/>
-            </w:pPr>
-            <w:r>
+          <w:tcPr>
+            <w:tcW w:w="2267" w:type="dxa"/>
+          </w:tcPr>
+          <w:p>
+            <w:pPr>
+              <w:pStyle w:val="Compact"/>
+              <w:keepNext/>
+              <w:spacing w:before="20" w:after="20"/>
+              <w:jc w:val="center"/>
+            </w:pPr>
+            <w:r>
+              <w:rPr>
+                <w:sz w:val="20"/>
+              </w:rPr>
               <w:t xml:space="preserve">0,50</w:t>
             </w:r>
           </w:p>
         </w:tc>
         <w:tc>
-          <w:p>
-            <w:pPr>
-              <w:pStyle w:val="Compact"/>
-              <w:jc w:val="left"/>
-            </w:pPr>
-            <w:r>
+          <w:tcPr>
+            <w:tcW w:w="2267" w:type="dxa"/>
+          </w:tcPr>
+          <w:p>
+            <w:pPr>
+              <w:pStyle w:val="Compact"/>
+              <w:keepNext/>
+              <w:spacing w:before="20" w:after="20"/>
+              <w:jc w:val="center"/>
+            </w:pPr>
+            <w:r>
+              <w:rPr>
+                <w:sz w:val="20"/>
+              </w:rPr>
               <w:t xml:space="preserve">0,002</w:t>
             </w:r>
           </w:p>
         </w:tc>
       </w:tr>
       <w:tr>
-        <w:tc>
-          <w:p>
-            <w:pPr>
-              <w:pStyle w:val="Compact"/>
-              <w:jc w:val="left"/>
-            </w:pPr>
-            <w:r>
+        <w:trPr>
+          <w:cantSplit/>
+        </w:trPr>
+        <w:tc>
+          <w:tcPr>
+            <w:tcW w:w="2267" w:type="dxa"/>
+          </w:tcPr>
+          <w:p>
+            <w:pPr>
+              <w:pStyle w:val="Compact"/>
+              <w:keepNext/>
+              <w:spacing w:before="20" w:after="20"/>
+              <w:jc w:val="left"/>
+            </w:pPr>
+            <w:r>
+              <w:rPr>
+                <w:sz w:val="20"/>
+              </w:rPr>
               <w:t xml:space="preserve">¿Cuál de los 3 tratamientos?</w:t>
             </w:r>
           </w:p>
         </w:tc>
         <w:tc>
-          <w:p>
-            <w:pPr>
-              <w:pStyle w:val="Compact"/>
-              <w:jc w:val="left"/>
-            </w:pPr>
-            <w:r>
+          <w:tcPr>
+            <w:tcW w:w="2267" w:type="dxa"/>
+          </w:tcPr>
+          <w:p>
+            <w:pPr>
+              <w:pStyle w:val="Compact"/>
+              <w:keepNext/>
+              <w:spacing w:before="20" w:after="20"/>
+              <w:jc w:val="center"/>
+            </w:pPr>
+            <w:r>
+              <w:rPr>
+                <w:sz w:val="20"/>
+              </w:rPr>
               <w:t xml:space="preserve">0,46 ± 0,08</w:t>
             </w:r>
           </w:p>
         </w:tc>
         <w:tc>
-          <w:p>
-            <w:pPr>
-              <w:pStyle w:val="Compact"/>
-              <w:jc w:val="left"/>
-            </w:pPr>
-            <w:r>
+          <w:tcPr>
+            <w:tcW w:w="2267" w:type="dxa"/>
+          </w:tcPr>
+          <w:p>
+            <w:pPr>
+              <w:pStyle w:val="Compact"/>
+              <w:keepNext/>
+              <w:spacing w:before="20" w:after="20"/>
+              <w:jc w:val="center"/>
+            </w:pPr>
+            <w:r>
+              <w:rPr>
+                <w:sz w:val="20"/>
+              </w:rPr>
               <w:t xml:space="preserve">0,33</w:t>
             </w:r>
           </w:p>
         </w:tc>
         <w:tc>
-          <w:p>
-            <w:pPr>
-              <w:pStyle w:val="Compact"/>
-              <w:jc w:val="left"/>
-            </w:pPr>
-            <w:r>
+          <w:tcPr>
+            <w:tcW w:w="2267" w:type="dxa"/>
+          </w:tcPr>
+          <w:p>
+            <w:pPr>
+              <w:pStyle w:val="Compact"/>
+              <w:keepNext/>
+              <w:spacing w:before="20" w:after="20"/>
+              <w:jc w:val="center"/>
+            </w:pPr>
+            <w:r>
+              <w:rPr>
+                <w:sz w:val="20"/>
+              </w:rPr>
               <w:t xml:space="preserve">0,080 (no significativo)</w:t>
             </w:r>
           </w:p>
         </w:tc>
       </w:tr>
       <w:tr>
-        <w:tc>
-          <w:p>
-            <w:pPr>
-              <w:pStyle w:val="Compact"/>
-              <w:jc w:val="left"/>
-            </w:pPr>
-            <w:r>
+        <w:trPr>
+          <w:cantSplit/>
+        </w:trPr>
+        <w:tc>
+          <w:tcPr>
+            <w:tcW w:w="2267" w:type="dxa"/>
+          </w:tcPr>
+          <w:p>
+            <w:pPr>
+              <w:pStyle w:val="Compact"/>
+              <w:keepNext/>
+              <w:spacing w:before="20" w:after="20"/>
+              <w:jc w:val="left"/>
+            </w:pPr>
+            <w:r>
+              <w:rPr>
+                <w:sz w:val="20"/>
+              </w:rPr>
               <w:t xml:space="preserve">Control: ¿6 grupos, sumando la distancia?</w:t>
             </w:r>
           </w:p>
         </w:tc>
         <w:tc>
-          <w:p>
-            <w:pPr>
-              <w:pStyle w:val="Compact"/>
-              <w:jc w:val="left"/>
-            </w:pPr>
-            <w:r>
+          <w:tcPr>
+            <w:tcW w:w="2267" w:type="dxa"/>
+          </w:tcPr>
+          <w:p>
+            <w:pPr>
+              <w:pStyle w:val="Compact"/>
+              <w:keepNext/>
+              <w:spacing w:before="20" w:after="20"/>
+              <w:jc w:val="center"/>
+            </w:pPr>
+            <w:r>
+              <w:rPr>
+                <w:sz w:val="20"/>
+              </w:rPr>
               <w:t xml:space="preserve">0,39 ± 0,10</w:t>
             </w:r>
           </w:p>
         </w:tc>
         <w:tc>
-          <w:p>
-            <w:pPr>
-              <w:pStyle w:val="Compact"/>
-              <w:jc w:val="left"/>
-            </w:pPr>
-            <w:r>
+          <w:tcPr>
+            <w:tcW w:w="2267" w:type="dxa"/>
+          </w:tcPr>
+          <w:p>
+            <w:pPr>
+              <w:pStyle w:val="Compact"/>
+              <w:keepNext/>
+              <w:spacing w:before="20" w:after="20"/>
+              <w:jc w:val="center"/>
+            </w:pPr>
+            <w:r>
+              <w:rPr>
+                <w:sz w:val="20"/>
+              </w:rPr>
               <w:t xml:space="preserve">0,17</w:t>
             </w:r>
           </w:p>
         </w:tc>
         <w:tc>
-          <w:p>
-            <w:pPr>
-              <w:pStyle w:val="Compact"/>
-              <w:jc w:val="left"/>
-            </w:pPr>
-            <w:r>
+          <w:tcPr>
+            <w:tcW w:w="2267" w:type="dxa"/>
+          </w:tcPr>
+          <w:p>
+            <w:pPr>
+              <w:pStyle w:val="Compact"/>
+              <w:keepNext/>
+              <w:spacing w:before="20" w:after="20"/>
+              <w:jc w:val="center"/>
+            </w:pPr>
+            <w:r>
+              <w:rPr>
+                <w:sz w:val="20"/>
+              </w:rPr>
               <w:t xml:space="preserve">0,002</w:t>
             </w:r>
           </w:p>
         </w:tc>
       </w:tr>
       <w:tr>
-        <w:tc>
-          <w:p>
-            <w:pPr>
-              <w:pStyle w:val="Compact"/>
-              <w:jc w:val="left"/>
-            </w:pPr>
-            <w:r>
+        <w:trPr>
+          <w:cantSplit/>
+        </w:trPr>
+        <w:tc>
+          <w:tcPr>
+            <w:tcW w:w="2267" w:type="dxa"/>
+          </w:tcPr>
+          <w:p>
+            <w:pPr>
+              <w:pStyle w:val="Compact"/>
+              <w:keepNext/>
+              <w:spacing w:before="20" w:after="20"/>
+              <w:jc w:val="left"/>
+            </w:pPr>
+            <w:r>
+              <w:rPr>
+                <w:sz w:val="20"/>
+              </w:rPr>
               <w:t xml:space="preserve">Control: ¿de qué cohorte es, con la distancia?</w:t>
             </w:r>
           </w:p>
         </w:tc>
         <w:tc>
-          <w:p>
-            <w:pPr>
-              <w:pStyle w:val="Compact"/>
-              <w:jc w:val="left"/>
-            </w:pPr>
-            <w:r>
+          <w:tcPr>
+            <w:tcW w:w="2267" w:type="dxa"/>
+          </w:tcPr>
+          <w:p>
+            <w:pPr>
+              <w:pStyle w:val="Compact"/>
+              <w:keepNext/>
+              <w:spacing w:before="20" w:after="20"/>
+              <w:jc w:val="center"/>
+            </w:pPr>
+            <w:r>
+              <w:rPr>
+                <w:sz w:val="20"/>
+              </w:rPr>
               <w:t xml:space="preserve">0,83 ± 0,08</w:t>
             </w:r>
           </w:p>
         </w:tc>
         <w:tc>
-          <w:p>
-            <w:pPr>
-              <w:pStyle w:val="Compact"/>
-              <w:jc w:val="left"/>
-            </w:pPr>
-            <w:r>
+          <w:tcPr>
+            <w:tcW w:w="2267" w:type="dxa"/>
+          </w:tcPr>
+          <w:p>
+            <w:pPr>
+              <w:pStyle w:val="Compact"/>
+              <w:keepNext/>
+              <w:spacing w:before="20" w:after="20"/>
+              <w:jc w:val="center"/>
+            </w:pPr>
+            <w:r>
+              <w:rPr>
+                <w:sz w:val="20"/>
+              </w:rPr>
               <w:t xml:space="preserve">0,50</w:t>
             </w:r>
           </w:p>
         </w:tc>
         <w:tc>
-          <w:p>
-            <w:pPr>
-              <w:pStyle w:val="Compact"/>
-              <w:jc w:val="left"/>
-            </w:pPr>
-            <w:r>
+          <w:tcPr>
+            <w:tcW w:w="2267" w:type="dxa"/>
+          </w:tcPr>
+          <w:p>
+            <w:pPr>
+              <w:pStyle w:val="Compact"/>
+              <w:keepNext/>
+              <w:spacing w:before="20" w:after="20"/>
+              <w:jc w:val="center"/>
+            </w:pPr>
+            <w:r>
+              <w:rPr>
+                <w:sz w:val="20"/>
+              </w:rPr>
               <w:t xml:space="preserve">0,002</w:t>
             </w:r>
           </w:p>
         </w:tc>
       </w:tr>
       <w:tr>
-        <w:tc>
-          <w:p>
-            <w:pPr>
-              <w:pStyle w:val="Compact"/>
-              <w:jc w:val="left"/>
-            </w:pPr>
-            <w:r>
+        <w:trPr>
+          <w:cantSplit/>
+        </w:trPr>
+        <w:tc>
+          <w:tcPr>
+            <w:tcW w:w="2267" w:type="dxa"/>
+          </w:tcPr>
+          <w:p>
+            <w:pPr>
+              <w:pStyle w:val="Compact"/>
+              <w:spacing w:before="20" w:after="20"/>
+              <w:jc w:val="left"/>
+            </w:pPr>
+            <w:r>
+              <w:rPr>
+                <w:sz w:val="20"/>
+              </w:rPr>
               <w:t xml:space="preserve">Control: ¿de qué cohorte es, sin la distancia?</w:t>
             </w:r>
           </w:p>
         </w:tc>
         <w:tc>
-          <w:p>
-            <w:pPr>
-              <w:pStyle w:val="Compact"/>
-              <w:jc w:val="left"/>
-            </w:pPr>
-            <w:r>
+          <w:tcPr>
+            <w:tcW w:w="2267" w:type="dxa"/>
+          </w:tcPr>
+          <w:p>
+            <w:pPr>
+              <w:pStyle w:val="Compact"/>
+              <w:spacing w:before="20" w:after="20"/>
+              <w:jc w:val="center"/>
+            </w:pPr>
+            <w:r>
+              <w:rPr>
+                <w:sz w:val="20"/>
+              </w:rPr>
               <w:t xml:space="preserve">0,62 ± 0,09</w:t>
             </w:r>
           </w:p>
         </w:tc>
         <w:tc>
-          <w:p>
-            <w:pPr>
-              <w:pStyle w:val="Compact"/>
-              <w:jc w:val="left"/>
-            </w:pPr>
-            <w:r>
+          <w:tcPr>
+            <w:tcW w:w="2267" w:type="dxa"/>
+          </w:tcPr>
+          <w:p>
+            <w:pPr>
+              <w:pStyle w:val="Compact"/>
+              <w:spacing w:before="20" w:after="20"/>
+              <w:jc w:val="center"/>
+            </w:pPr>
+            <w:r>
+              <w:rPr>
+                <w:sz w:val="20"/>
+              </w:rPr>
               <w:t xml:space="preserve">0,50</w:t>
             </w:r>
           </w:p>
         </w:tc>
         <w:tc>
-          <w:p>
-            <w:pPr>
-              <w:pStyle w:val="Compact"/>
-              <w:jc w:val="left"/>
-            </w:pPr>
-            <w:r>
+          <w:tcPr>
+            <w:tcW w:w="2267" w:type="dxa"/>
+          </w:tcPr>
+          <w:p>
+            <w:pPr>
+              <w:pStyle w:val="Compact"/>
+              <w:spacing w:before="20" w:after="20"/>
+              <w:jc w:val="center"/>
+            </w:pPr>
+            <w:r>
+              <w:rPr>
+                <w:sz w:val="20"/>
+              </w:rPr>
               <w:t xml:space="preserve">0,066 (no significativo)</w:t>
             </w:r>
           </w:p>
@@ -1498,6 +2284,8 @@
     <w:p>
       <w:pPr>
         <w:pStyle w:val="BodyText"/>
+        <w:keepNext/>
+        <w:jc w:val="center"/>
       </w:pPr>
       <w:r>
         <w:drawing>
@@ -2236,10 +3024,13 @@
     <w:basedOn w:val="Normal"/>
     <w:link w:val="BodyTextChar"/>
     <w:pPr>
-      <w:spacing w:after="180" w:before="180"/>
+      <w:spacing w:after="120" w:before="180" w:line="276" w:lineRule="auto"/>
       <w:jc w:val="both"/>
     </w:pPr>
     <w:qFormat/>
+    <w:rPr>
+      <w:sz w:val="22"/>
+    </w:rPr>
   </w:style>
   <w:style w:customStyle="1" w:styleId="FirstParagraph" w:type="paragraph">
     <w:name w:val="First Paragraph"/>
@@ -2247,8 +3038,12 @@
     <w:next w:val="BodyText"/>
     <w:qFormat/>
     <w:pPr>
+      <w:spacing w:after="120" w:line="276" w:lineRule="auto"/>
       <w:jc w:val="both"/>
     </w:pPr>
+    <w:rPr>
+      <w:sz w:val="22"/>
+    </w:rPr>
   </w:style>
   <w:style w:customStyle="1" w:styleId="Compact" w:type="paragraph">
     <w:name w:val="Compact"/>
@@ -2273,7 +3068,7 @@
       <w:rFonts w:asciiTheme="majorHAnsi" w:cstheme="majorBidi" w:eastAsiaTheme="majorEastAsia" w:hAnsiTheme="majorHAnsi"/>
       <w:b/>
       <w:bCs/>
-      <w:color w:themeColor="accent1" w:themeShade="B5" w:val="345A8A"/>
+      <w:color w:val="000000"/>
       <w:sz w:val="36"/>
       <w:szCs w:val="36"/>
     </w:rPr>
@@ -2353,7 +3148,7 @@
       <w:rFonts w:asciiTheme="majorHAnsi" w:cstheme="majorBidi" w:eastAsiaTheme="majorEastAsia" w:hAnsiTheme="majorHAnsi"/>
       <w:b/>
       <w:bCs/>
-      <w:color w:themeColor="accent1" w:val="4F81BD"/>
+      <w:color w:val="000000"/>
       <w:sz w:val="32"/>
       <w:szCs w:val="32"/>
     </w:rPr>
@@ -2375,7 +3170,7 @@
       <w:rFonts w:asciiTheme="majorHAnsi" w:cstheme="majorBidi" w:eastAsiaTheme="majorEastAsia" w:hAnsiTheme="majorHAnsi"/>
       <w:b/>
       <w:bCs/>
-      <w:color w:themeColor="accent1" w:val="4F81BD"/>
+      <w:color w:val="000000"/>
       <w:sz w:val="28"/>
       <w:szCs w:val="28"/>
     </w:rPr>
@@ -2397,7 +3192,7 @@
       <w:rFonts w:asciiTheme="majorHAnsi" w:cstheme="majorBidi" w:eastAsiaTheme="majorEastAsia" w:hAnsiTheme="majorHAnsi"/>
       <w:b/>
       <w:bCs/>
-      <w:color w:themeColor="accent1" w:val="4F81BD"/>
+      <w:color w:val="000000"/>
       <w:sz w:val="24"/>
       <w:szCs w:val="24"/>
     </w:rPr>
@@ -2419,7 +3214,7 @@
       <w:rFonts w:asciiTheme="majorHAnsi" w:cstheme="majorBidi" w:eastAsiaTheme="majorEastAsia" w:hAnsiTheme="majorHAnsi"/>
       <w:i/>
       <w:bCs/>
-      <w:color w:themeColor="accent1" w:val="4F81BD"/>
+      <w:color w:val="000000"/>
       <w:sz w:val="24"/>
       <w:szCs w:val="24"/>
     </w:rPr>
@@ -2440,7 +3235,7 @@
     <w:rPr>
       <w:rFonts w:asciiTheme="majorHAnsi" w:cstheme="majorBidi" w:eastAsiaTheme="majorEastAsia" w:hAnsiTheme="majorHAnsi"/>
       <w:iCs/>
-      <w:color w:themeColor="accent1" w:val="4F81BD"/>
+      <w:color w:val="000000"/>
       <w:sz w:val="24"/>
       <w:szCs w:val="24"/>
     </w:rPr>
@@ -2460,7 +3255,7 @@
     </w:pPr>
     <w:rPr>
       <w:rFonts w:asciiTheme="majorHAnsi" w:cstheme="majorBidi" w:eastAsiaTheme="majorEastAsia" w:hAnsiTheme="majorHAnsi"/>
-      <w:color w:themeColor="accent1" w:val="4F81BD"/>
+      <w:color w:val="000000"/>
       <w:sz w:val="24"/>
       <w:szCs w:val="24"/>
     </w:rPr>
@@ -2480,7 +3275,7 @@
     </w:pPr>
     <w:rPr>
       <w:rFonts w:asciiTheme="majorHAnsi" w:cstheme="majorBidi" w:eastAsiaTheme="majorEastAsia" w:hAnsiTheme="majorHAnsi"/>
-      <w:color w:themeColor="accent1" w:val="4F81BD"/>
+      <w:color w:val="000000"/>
       <w:sz w:val="24"/>
       <w:szCs w:val="24"/>
     </w:rPr>
@@ -2500,7 +3295,7 @@
     </w:pPr>
     <w:rPr>
       <w:rFonts w:asciiTheme="majorHAnsi" w:cstheme="majorBidi" w:eastAsiaTheme="majorEastAsia" w:hAnsiTheme="majorHAnsi"/>
-      <w:color w:themeColor="accent1" w:val="4F81BD"/>
+      <w:color w:val="000000"/>
       <w:sz w:val="24"/>
       <w:szCs w:val="24"/>
     </w:rPr>
@@ -2520,7 +3315,7 @@
     </w:pPr>
     <w:rPr>
       <w:rFonts w:asciiTheme="majorHAnsi" w:cstheme="majorBidi" w:eastAsiaTheme="majorEastAsia" w:hAnsiTheme="majorHAnsi"/>
-      <w:color w:themeColor="accent1" w:val="4F81BD"/>
+      <w:color w:val="000000"/>
       <w:sz w:val="24"/>
       <w:szCs w:val="24"/>
     </w:rPr>

</xml_diff>